<commit_message>
docs(Documentation): say why the repository exists in Set up the repository
The repository admin often reads only this article. The lead now states in one
sentence what the repository is (the team's shared knowledge base, read and
written by each teammate's Claude Code), why step 3 grants write and not
read-only, and that step 4 is where the safety comes from. Rebuilt site + both
Word editions; footer v2.3 → v2.4.

Co-Authored-By: Claude Opus 5 <noreply@anthropic.com>
</commit_message>
<xml_diff>
--- a/Documentation/Work-OS-Team-Setup-Azure-Repos.docx
+++ b/Documentation/Work-OS-Team-Setup-Azure-Repos.docx
@@ -23446,7 +23446,43 @@
           <w:sz w:val="22"/>
           <w:szCs w:val="22"/>
         </w:rPr>
-        <w:t xml:space="preserve">. In this article you import the Work OS from SoftServe, create the admin group, give people access, and protect the main branch — all in the </w:t>
+        <w:t xml:space="preserve">. The repository you are about to create is the team's shared knowledge base: Claude Code reads it on each teammate's computer before it drafts anything and saves their finished work straight back into it — so everyone needs read </w:t>
+      </w:r>
+      <w:r>
+        <w:rPr>
+          <w:i/>
+          <w:iCs/>
+          <w:color w:val="425466"/>
+          <w:sz w:val="22"/>
+          <w:szCs w:val="22"/>
+        </w:rPr>
+        <w:t xml:space="preserve">and</w:t>
+      </w:r>
+      <w:r>
+        <w:rPr>
+          <w:color w:val="425466"/>
+          <w:sz w:val="22"/>
+          <w:szCs w:val="22"/>
+        </w:rPr>
+        <w:t xml:space="preserve"> write access, not read-only, while step 4 protects </w:t>
+      </w:r>
+      <w:r>
+        <w:rPr>
+          <w:rFonts w:ascii="Consolas" w:cs="Consolas" w:eastAsia="Consolas" w:hAnsi="Consolas"/>
+          <w:color w:val="425466"/>
+          <w:sz w:val="21"/>
+          <w:szCs w:val="21"/>
+          <w:shd w:fill="EDF0F2" w:val="clear"/>
+        </w:rPr>
+        <w:t xml:space="preserve">main</w:t>
+      </w:r>
+      <w:r>
+        <w:rPr>
+          <w:color w:val="425466"/>
+          <w:sz w:val="22"/>
+          <w:szCs w:val="22"/>
+        </w:rPr>
+        <w:t xml:space="preserve"> so that the few files steering the whole system still need a Work OS admin's approval. In this article you import the Work OS from SoftServe, create the admin group, give people access, and protect the main branch — all in the </w:t>
       </w:r>
       <w:r>
         <w:rPr>
@@ -25708,7 +25744,7 @@
       <w:r>
         <w:t xml:space="preserve"> — the tool the Work OS runs on: it brings the repository to your computer, and auto-sync uses it to save your work. Install it from your organization's software catalog, or from </w:t>
       </w:r>
-      <w:hyperlink w:history="1" r:id="rIdmlnlo_g-g9ckoxwutefdh">
+      <w:hyperlink w:history="1" r:id="rIdl2fjvblebcfg5nnukgttg">
         <w:r>
           <w:rPr>
             <w:color w:val="0E5E8B"/>
@@ -25808,7 +25844,7 @@
       <w:r>
         <w:t xml:space="preserve"> — install it from your organization's software catalog, or from </w:t>
       </w:r>
-      <w:hyperlink w:history="1" r:id="rIdn5hevj0dendyw58q_d6gx">
+      <w:hyperlink w:history="1" r:id="rIdm9dporbglforg_wahqx9u">
         <w:r>
           <w:rPr>
             <w:color w:val="0E5E8B"/>
@@ -32325,7 +32361,7 @@
         <w:sz w:val="16"/>
         <w:szCs w:val="16"/>
       </w:rPr>
-      <w:t xml:space="preserve">SoftServe · Work OS team setup · Azure Repos edition · v2.3 · August 2026</w:t>
+      <w:t xml:space="preserve">SoftServe · Work OS team setup · Azure Repos edition · v2.4 · August 2026</w:t>
     </w:r>
     <w:r>
       <w:rPr>

</xml_diff>